<commit_message>
Record successful GitHub CI run in report
</commit_message>
<xml_diff>
--- a/reports/MLOps_Assignment_Report.docx
+++ b/reports/MLOps_Assignment_Report.docx
@@ -4655,7 +4655,7 @@
                 <w:color w:val="263238"/>
                 <w:sz w:val="17"/>
               </w:rPr>
-              <w:t>Pending (first workflow run starts after the initial push)</w:t>
+              <w:t>Passed (GitHub Actions run #1 on commit 258ec97; workflow concluded successfully)</w:t>
             </w:r>
           </w:p>
         </w:tc>
@@ -4733,7 +4733,7 @@
           <w:color w:val="263238"/>
           <w:sz w:val="21"/>
         </w:rPr>
-        <w:t>Current GitHub Actions status: Pending (first workflow run starts after the initial push). The workflow run page is the evidence for the remote result; save its screenshot after completion.</w:t>
+        <w:t>Current GitHub Actions status: Passed (GitHub Actions run #1 on commit 258ec97; workflow concluded successfully). Capture the completed first run page as docs/screenshots/github-actions-ci-passed.png before submission.</w:t>
       </w:r>
     </w:p>
     <w:p>
@@ -5313,7 +5313,7 @@
           <w:color w:val="263238"/>
           <w:sz w:val="19"/>
         </w:rPr>
-        <w:t>Docker Compose and the local Docker Desktop Kind cluster have both been exercised. The Kubernetes Deployment reached two ready replicas, and /health, /predict, and /metrics were verified through port-forwarding. Prometheus, Grafana, and Kubernetes screenshots are included in the repository. The current GitHub Actions result is Pending (first workflow run starts after the initial push). No public cloud endpoint is claimed; a short demo video and the course submission remain for the student. The dataset has only 303 historical records, so model metrics should not be used for diagnosis or health decisions.</w:t>
+        <w:t>Docker Compose and the local Docker Desktop Kind cluster have both been exercised. The Kubernetes Deployment reached two ready replicas, and /health, /predict, and /metrics were verified through port-forwarding. Prometheus, Grafana, and Kubernetes screenshots are included in the repository. The current GitHub Actions result is Passed (GitHub Actions run #1 on commit 258ec97; workflow concluded successfully). No public cloud endpoint is claimed; a short demo video and the course submission remain for the student. The dataset has only 303 historical records, so model metrics should not be used for diagnosis or health decisions.</w:t>
       </w:r>
     </w:p>
     <w:p>

</xml_diff>

<commit_message>
Add successful GitHub Actions screenshot evidence
</commit_message>
<xml_diff>
--- a/reports/MLOps_Assignment_Report.docx
+++ b/reports/MLOps_Assignment_Report.docx
@@ -4733,7 +4733,7 @@
           <w:color w:val="263238"/>
           <w:sz w:val="21"/>
         </w:rPr>
-        <w:t>Current GitHub Actions status: Passed (GitHub Actions run #1 on commit 258ec97; workflow concluded successfully). Capture the completed first run page as docs/screenshots/github-actions-ci-passed.png before submission.</w:t>
+        <w:t>Current GitHub Actions status: Passed (GitHub Actions run #1 on commit 258ec97; workflow concluded successfully). The completed first run is documented in docs/screenshots/github-actions-ci-passed.png.</w:t>
       </w:r>
     </w:p>
     <w:p>
@@ -5254,7 +5254,7 @@
                 <w:color w:val="263238"/>
                 <w:sz w:val="16"/>
               </w:rPr>
-              <w:t>Three runtime screenshots in docs/screenshots</w:t>
+              <w:t>Four evidence screenshots in docs/screenshots</w:t>
             </w:r>
           </w:p>
         </w:tc>
@@ -5313,7 +5313,7 @@
           <w:color w:val="263238"/>
           <w:sz w:val="19"/>
         </w:rPr>
-        <w:t>Docker Compose and the local Docker Desktop Kind cluster have both been exercised. The Kubernetes Deployment reached two ready replicas, and /health, /predict, and /metrics were verified through port-forwarding. Prometheus, Grafana, and Kubernetes screenshots are included in the repository. The current GitHub Actions result is Passed (GitHub Actions run #1 on commit 258ec97; workflow concluded successfully). No public cloud endpoint is claimed; a short demo video and the course submission remain for the student. The dataset has only 303 historical records, so model metrics should not be used for diagnosis or health decisions.</w:t>
+        <w:t>Docker Compose and the local Docker Desktop Kind cluster have both been exercised. The Kubernetes Deployment reached two ready replicas, and /health, /predict, and /metrics were verified through port-forwarding. Prometheus, Grafana, Kubernetes, and GitHub Actions screenshots are included. The current GitHub Actions result is Passed (GitHub Actions run #1 on commit 258ec97; workflow concluded successfully). No public cloud endpoint is claimed; a short demo video and the course submission remain for the student. The dataset has only 303 historical records, so model metrics should not be used for diagnosis or health decisions.</w:t>
       </w:r>
     </w:p>
     <w:p>

</xml_diff>

<commit_message>
Expand demo guide and refresh CI evidence
</commit_message>
<xml_diff>
--- a/reports/MLOps_Assignment_Report.docx
+++ b/reports/MLOps_Assignment_Report.docx
@@ -4655,7 +4655,7 @@
                 <w:color w:val="263238"/>
                 <w:sz w:val="17"/>
               </w:rPr>
-              <w:t>Passed (GitHub Actions run #1 on commit 258ec97; workflow concluded successfully)</w:t>
+              <w:t>Passed (recorded GitHub Actions run #3 on commit d04484f; workflow concluded successfully)</w:t>
             </w:r>
           </w:p>
         </w:tc>
@@ -4733,7 +4733,7 @@
           <w:color w:val="263238"/>
           <w:sz w:val="21"/>
         </w:rPr>
-        <w:t>Current GitHub Actions status: Passed (GitHub Actions run #1 on commit 258ec97; workflow concluded successfully). The completed first run is documented in docs/screenshots/github-actions-ci-passed.png.</w:t>
+        <w:t>Current GitHub Actions status: Passed (recorded GitHub Actions run #3 on commit d04484f; workflow concluded successfully). The recorded passing workflow run is documented in docs/screenshots/github-actions-ci-passed.png.</w:t>
       </w:r>
     </w:p>
     <w:p>
@@ -5313,7 +5313,7 @@
           <w:color w:val="263238"/>
           <w:sz w:val="19"/>
         </w:rPr>
-        <w:t>Docker Compose and the local Docker Desktop Kind cluster have both been exercised. The Kubernetes Deployment reached two ready replicas, and /health, /predict, and /metrics were verified through port-forwarding. Prometheus, Grafana, Kubernetes, and GitHub Actions screenshots are included. The current GitHub Actions result is Passed (GitHub Actions run #1 on commit 258ec97; workflow concluded successfully). No public cloud endpoint is claimed; a short demo video and the course submission remain for the student. The dataset has only 303 historical records, so model metrics should not be used for diagnosis or health decisions.</w:t>
+        <w:t>Docker Compose and the local Docker Desktop Kind cluster have both been exercised. The Kubernetes Deployment reached two ready replicas, and /health, /predict, and /metrics were verified through port-forwarding. Prometheus, Grafana, Kubernetes, and GitHub Actions screenshots are included. The current GitHub Actions result is Passed (recorded GitHub Actions run #3 on commit d04484f; workflow concluded successfully). No public cloud endpoint is claimed; a short demo video and the course submission remain for the student. The dataset has only 303 historical records, so model metrics should not be used for diagnosis or health decisions.</w:t>
       </w:r>
     </w:p>
     <w:p>

</xml_diff>

<commit_message>
Refresh CI proof to latest successful run
</commit_message>
<xml_diff>
--- a/reports/MLOps_Assignment_Report.docx
+++ b/reports/MLOps_Assignment_Report.docx
@@ -4655,7 +4655,7 @@
                 <w:color w:val="263238"/>
                 <w:sz w:val="17"/>
               </w:rPr>
-              <w:t>Passed (recorded GitHub Actions run #3 on commit d04484f; workflow concluded successfully)</w:t>
+              <w:t>Passed (recorded GitHub Actions run #4 on commit e808c1d; workflow concluded successfully)</w:t>
             </w:r>
           </w:p>
         </w:tc>
@@ -4733,7 +4733,7 @@
           <w:color w:val="263238"/>
           <w:sz w:val="21"/>
         </w:rPr>
-        <w:t>Current GitHub Actions status: Passed (recorded GitHub Actions run #3 on commit d04484f; workflow concluded successfully). The recorded passing workflow run is documented in docs/screenshots/github-actions-ci-passed.png.</w:t>
+        <w:t>Current GitHub Actions status: Passed (recorded GitHub Actions run #4 on commit e808c1d; workflow concluded successfully). The recorded passing workflow run is documented in docs/screenshots/github-actions-ci-passed.png.</w:t>
       </w:r>
     </w:p>
     <w:p>
@@ -5313,7 +5313,7 @@
           <w:color w:val="263238"/>
           <w:sz w:val="19"/>
         </w:rPr>
-        <w:t>Docker Compose and the local Docker Desktop Kind cluster have both been exercised. The Kubernetes Deployment reached two ready replicas, and /health, /predict, and /metrics were verified through port-forwarding. Prometheus, Grafana, Kubernetes, and GitHub Actions screenshots are included. The current GitHub Actions result is Passed (recorded GitHub Actions run #3 on commit d04484f; workflow concluded successfully). No public cloud endpoint is claimed; a short demo video and the course submission remain for the student. The dataset has only 303 historical records, so model metrics should not be used for diagnosis or health decisions.</w:t>
+        <w:t>Docker Compose and the local Docker Desktop Kind cluster have both been exercised. The Kubernetes Deployment reached two ready replicas, and /health, /predict, and /metrics were verified through port-forwarding. Prometheus, Grafana, Kubernetes, and GitHub Actions screenshots are included. The current GitHub Actions result is Passed (recorded GitHub Actions run #4 on commit e808c1d; workflow concluded successfully). No public cloud endpoint is claimed; a short demo video and the course submission remain for the student. The dataset has only 303 historical records, so model metrics should not be used for diagnosis or health decisions.</w:t>
       </w:r>
     </w:p>
     <w:p>

</xml_diff>